<commit_message>
Standardize FIRE and HOME dialogues for broker use
</commit_message>
<xml_diff>
--- a/18_DOCX/FIRE_DIALOGUES_0001_0005.docx
+++ b/18_DOCX/FIRE_DIALOGUES_0001_0005.docx
@@ -28,7 +28,7 @@
         <w:pStyle w:val="Heading2"/>
       </w:pPr>
       <w:r>
-        <w:t>Controle</w:t>
+        <w:t>管理情報</w:t>
       </w:r>
     </w:p>
     <w:p>
@@ -36,7 +36,7 @@
         <w:pStyle w:val="ListBullet"/>
       </w:pPr>
       <w:r>
-        <w:t>Versão: 0.1</w:t>
+        <w:t>Versão: 0.2</w:t>
       </w:r>
     </w:p>
     <w:p>
@@ -60,7 +60,7 @@
         <w:pStyle w:val="ListBullet"/>
       </w:pPr>
       <w:r>
-        <w:t>Histórico: Criação inicial.</w:t>
+        <w:t>Histórico: Criação inicial; padronização para uso do corretor japonês com fala em português e leitura em katakana.</w:t>
       </w:r>
     </w:p>
     <w:p>
@@ -68,7 +68,7 @@
         <w:pStyle w:val="Heading2"/>
       </w:pPr>
       <w:r>
-        <w:t>Código</w:t>
+        <w:t>コード</w:t>
       </w:r>
     </w:p>
     <w:p>
@@ -81,12 +81,12 @@
         <w:pStyle w:val="Heading2"/>
       </w:pPr>
       <w:r>
-        <w:t>Situação de atendimento</w:t>
-      </w:r>
-    </w:p>
-    <w:p>
-      <w:r>
-        <w:t>Cliente brasileiro quer entender separando edificação e bens domésticos no seguro contra incêndio no Japão.</w:t>
+        <w:t>対応場面</w:t>
+      </w:r>
+    </w:p>
+    <w:p>
+      <w:r>
+        <w:t>ブラジル人のお客様が「Separando edificação e bens domésticos」について相談しており、契約内容、補償範囲、責任関係、必要書類を確認する場面。</w:t>
       </w:r>
     </w:p>
     <w:p>
@@ -94,7 +94,7 @@
         <w:pStyle w:val="Heading2"/>
       </w:pPr>
       <w:r>
-        <w:t>Participantes</w:t>
+        <w:t>参加者</w:t>
       </w:r>
     </w:p>
     <w:p>
@@ -102,7 +102,7 @@
         <w:pStyle w:val="ListBullet"/>
       </w:pPr>
       <w:r>
-        <w:t>Corretor: corretor japonês</w:t>
+        <w:t>募集人: 日本人保険募集人</w:t>
       </w:r>
     </w:p>
     <w:p>
@@ -110,7 +110,7 @@
         <w:pStyle w:val="ListBullet"/>
       </w:pPr>
       <w:r>
-        <w:t>Cliente: cliente brasileiro residente no Japão</w:t>
+        <w:t>顧客: 日本在住のブラジル人顧客</w:t>
       </w:r>
     </w:p>
     <w:p>
@@ -118,12 +118,12 @@
         <w:pStyle w:val="Heading2"/>
       </w:pPr>
       <w:r>
-        <w:t>Objetivo do diálogo</w:t>
-      </w:r>
-    </w:p>
-    <w:p>
-      <w:r>
-        <w:t>Explicar separando edificação e bens domésticos com linguagem simples e sem prometer pagamento de indenização.</w:t>
+        <w:t>対話の目的</w:t>
+      </w:r>
+    </w:p>
+    <w:p>
+      <w:r>
+        <w:t>日本語で対応方針を理解し、ブラジルポルトガル語でお客様に自然に説明できるようにする。</w:t>
       </w:r>
     </w:p>
     <w:p>
@@ -131,27 +131,27 @@
         <w:pStyle w:val="Heading2"/>
       </w:pPr>
       <w:r>
-        <w:t>Versão em japonês</w:t>
-      </w:r>
-    </w:p>
-    <w:p>
-      <w:r>
-        <w:t>**Cliente:** 火災保険では何を確認すればよいですか。</w:t>
-      </w:r>
-    </w:p>
-    <w:p>
-      <w:r>
-        <w:t>**Corretor:** 建物、家財、補償範囲、免責金額を分けて確認します。</w:t>
-      </w:r>
-    </w:p>
-    <w:p>
-      <w:r>
-        <w:t>**Cliente:** 事故があれば必ず支払われますか。</w:t>
-      </w:r>
-    </w:p>
-    <w:p>
-      <w:r>
-        <w:t>**Corretor:** 支払可否は事故原因、契約条件、必要書類を保険会社が確認して判断します。</w:t>
+        <w:t>日本語版</w:t>
+      </w:r>
+    </w:p>
+    <w:p>
+      <w:r>
+        <w:t>**顧客:** 火災保険では何を確認すればよいですか。</w:t>
+      </w:r>
+    </w:p>
+    <w:p>
+      <w:r>
+        <w:t>**募集人:** 建物、家財、補償範囲、免責金額を分けて確認します。</w:t>
+      </w:r>
+    </w:p>
+    <w:p>
+      <w:r>
+        <w:t>**顧客:** 事故があれば必ず支払われますか。</w:t>
+      </w:r>
+    </w:p>
+    <w:p>
+      <w:r>
+        <w:t>**募集人:** 支払可否は事故原因、契約条件、必要書類を保険会社が確認して判断します。</w:t>
       </w:r>
     </w:p>
     <w:p>
@@ -159,27 +159,67 @@
         <w:pStyle w:val="Heading2"/>
       </w:pPr>
       <w:r>
-        <w:t>Versão em português brasileiro</w:t>
-      </w:r>
-    </w:p>
-    <w:p>
-      <w:r>
-        <w:t>**Cliente:** O que eu preciso conferir no seguro contra incêndio?</w:t>
-      </w:r>
-    </w:p>
-    <w:p>
-      <w:r>
-        <w:t>**Corretor:** Vamos separar edificação, bens domésticos, coberturas e franquia.</w:t>
-      </w:r>
-    </w:p>
-    <w:p>
-      <w:r>
-        <w:t>**Cliente:** Se acontecer um dano, sempre vou receber?</w:t>
-      </w:r>
-    </w:p>
-    <w:p>
-      <w:r>
-        <w:t>**Corretor:** A seguradora analisa a causa, as condições do contrato e os documentos antes de decidir o pagamento.</w:t>
+        <w:t>ブラジルポルトガル語版</w:t>
+      </w:r>
+    </w:p>
+    <w:p>
+      <w:r>
+        <w:t>**顧客:**</w:t>
+      </w:r>
+    </w:p>
+    <w:p>
+      <w:r>
+        <w:t>Leitura para pronúncia: オ オ キ エウ プレシーゾ コンフェリール ノ セグーロ コントラ インセンジオ</w:t>
+      </w:r>
+    </w:p>
+    <w:p>
+      <w:r>
+        <w:t>Português brasileiro: O que eu preciso conferir no seguro contra incêndio?</w:t>
+      </w:r>
+    </w:p>
+    <w:p>
+      <w:r>
+        <w:t>**Corretor:**</w:t>
+      </w:r>
+    </w:p>
+    <w:p>
+      <w:r>
+        <w:t>Leitura para pronúncia: ヴァモス セパラール エジフィカサォン ベンス ドメスチコス コベルツーラス イ フランキア</w:t>
+      </w:r>
+    </w:p>
+    <w:p>
+      <w:r>
+        <w:t>Português brasileiro: Vamos separar edificação, bens domésticos, coberturas e franquia.</w:t>
+      </w:r>
+    </w:p>
+    <w:p>
+      <w:r>
+        <w:t>**顧客:**</w:t>
+      </w:r>
+    </w:p>
+    <w:p>
+      <w:r>
+        <w:t>Leitura para pronúncia: セ アコンテセール ウン ダノ センプリ ヴォウ ヘセベール</w:t>
+      </w:r>
+    </w:p>
+    <w:p>
+      <w:r>
+        <w:t>Português brasileiro: Se acontecer um dano, sempre vou receber?</w:t>
+      </w:r>
+    </w:p>
+    <w:p>
+      <w:r>
+        <w:t>**Corretor:**</w:t>
+      </w:r>
+    </w:p>
+    <w:p>
+      <w:r>
+        <w:t>Leitura para pronúncia: ア セグラドーラ ANALISA ア カウザ AS CONDIÇÕES ド コントラート イ OS ドクメントス アンチス ジ デシジール オ パガメント</w:t>
+      </w:r>
+    </w:p>
+    <w:p>
+      <w:r>
+        <w:t>Português brasileiro: A seguradora analisa a causa, as condições do contrato e os documentos antes de decidir o pagamento.</w:t>
       </w:r>
     </w:p>
     <w:p>
@@ -187,7 +227,7 @@
         <w:pStyle w:val="Heading2"/>
       </w:pPr>
       <w:r>
-        <w:t>Notas culturais ou comerciais</w:t>
+        <w:t>文化・営業上の注意</w:t>
       </w:r>
     </w:p>
     <w:p>
@@ -195,7 +235,7 @@
         <w:pStyle w:val="ListBullet"/>
       </w:pPr>
       <w:r>
-        <w:t>Explicar que seguro contra incêndio no Japão pode incluir riscos além de fogo, conforme contratação.</w:t>
+        <w:t>不動産会社、管理会社、保証会社、保険会社の役割を混同しない。</w:t>
       </w:r>
     </w:p>
     <w:p>
@@ -203,7 +243,7 @@
         <w:pStyle w:val="ListBullet"/>
       </w:pPr>
       <w:r>
-        <w:t>Separar linguagem comercial de decisão formal da seguradora.</w:t>
+        <w:t>一般説明と保険会社の正式判断を分けて説明する。</w:t>
       </w:r>
     </w:p>
     <w:p>
@@ -211,7 +251,7 @@
         <w:pStyle w:val="Heading2"/>
       </w:pPr>
       <w:r>
-        <w:t>Pontos de atenção para o corretor</w:t>
+        <w:t>募集人の注意点</w:t>
       </w:r>
     </w:p>
     <w:p>
@@ -219,7 +259,7 @@
         <w:pStyle w:val="ListBullet"/>
       </w:pPr>
       <w:r>
-        <w:t>Confirmar se o imóvel é próprio ou alugado.</w:t>
+        <w:t>契約書、保険証券、事故状況、写真、領収書、管理会社からの案内を確認する。</w:t>
       </w:r>
     </w:p>
     <w:p>
@@ -227,7 +267,7 @@
         <w:pStyle w:val="ListBullet"/>
       </w:pPr>
       <w:r>
-        <w:t>Separar edificação, bens domésticos e cláusulas adicionais.</w:t>
+        <w:t>支払可否、費用負担、返金、審査結果を断定しない。</w:t>
       </w:r>
     </w:p>
     <w:p>
@@ -235,7 +275,7 @@
         <w:pStyle w:val="ListBullet"/>
       </w:pPr>
       <w:r>
-        <w:t>Evitar afirmar pagamento antes da análise do contrato e dos documentos.</w:t>
+        <w:t>お客様が理解できる短いポルトガル語で説明する。</w:t>
       </w:r>
     </w:p>
     <w:p>
@@ -243,7 +283,7 @@
         <w:pStyle w:val="Heading2"/>
       </w:pPr>
       <w:r>
-        <w:t>Casos relacionados</w:t>
+        <w:t>関連ケース</w:t>
       </w:r>
     </w:p>
     <w:p>
@@ -267,7 +307,7 @@
         <w:pStyle w:val="Heading2"/>
       </w:pPr>
       <w:r>
-        <w:t>Termos relacionados</w:t>
+        <w:t>関連用語</w:t>
       </w:r>
     </w:p>
     <w:p>
@@ -307,7 +347,7 @@
         <w:pStyle w:val="Heading2"/>
       </w:pPr>
       <w:r>
-        <w:t>FAQs relacionadas</w:t>
+        <w:t>関連FAQ</w:t>
       </w:r>
     </w:p>
     <w:p>
@@ -347,7 +387,7 @@
         <w:pStyle w:val="Heading2"/>
       </w:pPr>
       <w:r>
-        <w:t>Referências cruzadas</w:t>
+        <w:t>相互参照</w:t>
       </w:r>
     </w:p>
     <w:p>
@@ -387,7 +427,7 @@
         <w:pStyle w:val="Heading2"/>
       </w:pPr>
       <w:r>
-        <w:t>Referências</w:t>
+        <w:t>参考資料</w:t>
       </w:r>
     </w:p>
     <w:p>
@@ -403,7 +443,7 @@
         <w:pStyle w:val="Heading2"/>
       </w:pPr>
       <w:r>
-        <w:t>Tags</w:t>
+        <w:t>タグ</w:t>
       </w:r>
     </w:p>
     <w:p>
@@ -435,7 +475,7 @@
         <w:pStyle w:val="ListBullet"/>
       </w:pPr>
       <w:r>
-        <w:t>seguro-contra-incêndio</w:t>
+        <w:t>japanese-broker</w:t>
       </w:r>
     </w:p>
     <w:p>
@@ -443,7 +483,7 @@
         <w:pStyle w:val="Heading2"/>
       </w:pPr>
       <w:r>
-        <w:t>Veja também</w:t>
+        <w:t>関連項目</w:t>
       </w:r>
     </w:p>
     <w:p>
@@ -459,7 +499,7 @@
         <w:pStyle w:val="Heading2"/>
       </w:pPr>
       <w:r>
-        <w:t>Histórico de revisão</w:t>
+        <w:t>改訂履歴</w:t>
       </w:r>
     </w:p>
     <w:p>
@@ -479,6 +519,11 @@
     </w:p>
     <w:p>
       <w:r>
+        <w:t>| 2026-06-27 | 0.2 | JP-BR Insurance Knowledge Base | Padronização para uso do corretor japonês com fala em português e leitura em katakana. |</w:t>
+      </w:r>
+    </w:p>
+    <w:p>
+      <w:r>
         <w:br w:type="page"/>
       </w:r>
     </w:p>
@@ -495,7 +540,7 @@
         <w:pStyle w:val="Heading2"/>
       </w:pPr>
       <w:r>
-        <w:t>Controle</w:t>
+        <w:t>管理情報</w:t>
       </w:r>
     </w:p>
     <w:p>
@@ -503,7 +548,7 @@
         <w:pStyle w:val="ListBullet"/>
       </w:pPr>
       <w:r>
-        <w:t>Versão: 0.1</w:t>
+        <w:t>Versão: 0.2</w:t>
       </w:r>
     </w:p>
     <w:p>
@@ -527,7 +572,7 @@
         <w:pStyle w:val="ListBullet"/>
       </w:pPr>
       <w:r>
-        <w:t>Histórico: Criação inicial.</w:t>
+        <w:t>Histórico: Criação inicial; padronização para uso do corretor japonês com fala em português e leitura em katakana.</w:t>
       </w:r>
     </w:p>
     <w:p>
@@ -535,7 +580,7 @@
         <w:pStyle w:val="Heading2"/>
       </w:pPr>
       <w:r>
-        <w:t>Código</w:t>
+        <w:t>コード</w:t>
       </w:r>
     </w:p>
     <w:p>
@@ -548,12 +593,12 @@
         <w:pStyle w:val="Heading2"/>
       </w:pPr>
       <w:r>
-        <w:t>Situação de atendimento</w:t>
-      </w:r>
-    </w:p>
-    <w:p>
-      <w:r>
-        <w:t>Cliente brasileiro quer entender explicando franquia e valor de reposição no seguro contra incêndio no Japão.</w:t>
+        <w:t>対応場面</w:t>
+      </w:r>
+    </w:p>
+    <w:p>
+      <w:r>
+        <w:t>ブラジル人のお客様が「Explicando franquia e valor de reposição」について相談しており、契約内容、補償範囲、責任関係、必要書類を確認する場面。</w:t>
       </w:r>
     </w:p>
     <w:p>
@@ -561,7 +606,7 @@
         <w:pStyle w:val="Heading2"/>
       </w:pPr>
       <w:r>
-        <w:t>Participantes</w:t>
+        <w:t>参加者</w:t>
       </w:r>
     </w:p>
     <w:p>
@@ -569,7 +614,7 @@
         <w:pStyle w:val="ListBullet"/>
       </w:pPr>
       <w:r>
-        <w:t>Corretor: corretor japonês</w:t>
+        <w:t>募集人: 日本人保険募集人</w:t>
       </w:r>
     </w:p>
     <w:p>
@@ -577,7 +622,7 @@
         <w:pStyle w:val="ListBullet"/>
       </w:pPr>
       <w:r>
-        <w:t>Cliente: cliente brasileiro residente no Japão</w:t>
+        <w:t>顧客: 日本在住のブラジル人顧客</w:t>
       </w:r>
     </w:p>
     <w:p>
@@ -585,12 +630,12 @@
         <w:pStyle w:val="Heading2"/>
       </w:pPr>
       <w:r>
-        <w:t>Objetivo do diálogo</w:t>
-      </w:r>
-    </w:p>
-    <w:p>
-      <w:r>
-        <w:t>Explicar explicando franquia e valor de reposição com linguagem simples e sem prometer pagamento de indenização.</w:t>
+        <w:t>対話の目的</w:t>
+      </w:r>
+    </w:p>
+    <w:p>
+      <w:r>
+        <w:t>日本語で対応方針を理解し、ブラジルポルトガル語でお客様に自然に説明できるようにする。</w:t>
       </w:r>
     </w:p>
     <w:p>
@@ -598,27 +643,27 @@
         <w:pStyle w:val="Heading2"/>
       </w:pPr>
       <w:r>
-        <w:t>Versão em japonês</w:t>
-      </w:r>
-    </w:p>
-    <w:p>
-      <w:r>
-        <w:t>**Cliente:** 火災保険では何を確認すればよいですか。</w:t>
-      </w:r>
-    </w:p>
-    <w:p>
-      <w:r>
-        <w:t>**Corretor:** 建物、家財、補償範囲、免責金額を分けて確認します。</w:t>
-      </w:r>
-    </w:p>
-    <w:p>
-      <w:r>
-        <w:t>**Cliente:** 事故があれば必ず支払われますか。</w:t>
-      </w:r>
-    </w:p>
-    <w:p>
-      <w:r>
-        <w:t>**Corretor:** 支払可否は事故原因、契約条件、必要書類を保険会社が確認して判断します。</w:t>
+        <w:t>日本語版</w:t>
+      </w:r>
+    </w:p>
+    <w:p>
+      <w:r>
+        <w:t>**顧客:** 火災保険では何を確認すればよいですか。</w:t>
+      </w:r>
+    </w:p>
+    <w:p>
+      <w:r>
+        <w:t>**募集人:** 建物、家財、補償範囲、免責金額を分けて確認します。</w:t>
+      </w:r>
+    </w:p>
+    <w:p>
+      <w:r>
+        <w:t>**顧客:** 事故があれば必ず支払われますか。</w:t>
+      </w:r>
+    </w:p>
+    <w:p>
+      <w:r>
+        <w:t>**募集人:** 支払可否は事故原因、契約条件、必要書類を保険会社が確認して判断します。</w:t>
       </w:r>
     </w:p>
     <w:p>
@@ -626,27 +671,67 @@
         <w:pStyle w:val="Heading2"/>
       </w:pPr>
       <w:r>
-        <w:t>Versão em português brasileiro</w:t>
-      </w:r>
-    </w:p>
-    <w:p>
-      <w:r>
-        <w:t>**Cliente:** O que eu preciso conferir no seguro contra incêndio?</w:t>
-      </w:r>
-    </w:p>
-    <w:p>
-      <w:r>
-        <w:t>**Corretor:** Vamos separar edificação, bens domésticos, coberturas e franquia.</w:t>
-      </w:r>
-    </w:p>
-    <w:p>
-      <w:r>
-        <w:t>**Cliente:** Se acontecer um dano, sempre vou receber?</w:t>
-      </w:r>
-    </w:p>
-    <w:p>
-      <w:r>
-        <w:t>**Corretor:** A seguradora analisa a causa, as condições do contrato e os documentos antes de decidir o pagamento.</w:t>
+        <w:t>ブラジルポルトガル語版</w:t>
+      </w:r>
+    </w:p>
+    <w:p>
+      <w:r>
+        <w:t>**顧客:**</w:t>
+      </w:r>
+    </w:p>
+    <w:p>
+      <w:r>
+        <w:t>Leitura para pronúncia: オ オ キ エウ プレシーゾ コンフェリール ノ セグーロ コントラ インセンジオ</w:t>
+      </w:r>
+    </w:p>
+    <w:p>
+      <w:r>
+        <w:t>Português brasileiro: O que eu preciso conferir no seguro contra incêndio?</w:t>
+      </w:r>
+    </w:p>
+    <w:p>
+      <w:r>
+        <w:t>**Corretor:**</w:t>
+      </w:r>
+    </w:p>
+    <w:p>
+      <w:r>
+        <w:t>Leitura para pronúncia: ヴァモス セパラール エジフィカサォン ベンス ドメスチコス コベルツーラス イ フランキア</w:t>
+      </w:r>
+    </w:p>
+    <w:p>
+      <w:r>
+        <w:t>Português brasileiro: Vamos separar edificação, bens domésticos, coberturas e franquia.</w:t>
+      </w:r>
+    </w:p>
+    <w:p>
+      <w:r>
+        <w:t>**顧客:**</w:t>
+      </w:r>
+    </w:p>
+    <w:p>
+      <w:r>
+        <w:t>Leitura para pronúncia: セ アコンテセール ウン ダノ センプリ ヴォウ ヘセベール</w:t>
+      </w:r>
+    </w:p>
+    <w:p>
+      <w:r>
+        <w:t>Português brasileiro: Se acontecer um dano, sempre vou receber?</w:t>
+      </w:r>
+    </w:p>
+    <w:p>
+      <w:r>
+        <w:t>**Corretor:**</w:t>
+      </w:r>
+    </w:p>
+    <w:p>
+      <w:r>
+        <w:t>Leitura para pronúncia: ア セグラドーラ ANALISA ア カウザ AS CONDIÇÕES ド コントラート イ OS ドクメントス アンチス ジ デシジール オ パガメント</w:t>
+      </w:r>
+    </w:p>
+    <w:p>
+      <w:r>
+        <w:t>Português brasileiro: A seguradora analisa a causa, as condições do contrato e os documentos antes de decidir o pagamento.</w:t>
       </w:r>
     </w:p>
     <w:p>
@@ -654,7 +739,7 @@
         <w:pStyle w:val="Heading2"/>
       </w:pPr>
       <w:r>
-        <w:t>Notas culturais ou comerciais</w:t>
+        <w:t>文化・営業上の注意</w:t>
       </w:r>
     </w:p>
     <w:p>
@@ -662,7 +747,7 @@
         <w:pStyle w:val="ListBullet"/>
       </w:pPr>
       <w:r>
-        <w:t>Explicar que seguro contra incêndio no Japão pode incluir riscos além de fogo, conforme contratação.</w:t>
+        <w:t>不動産会社、管理会社、保証会社、保険会社の役割を混同しない。</w:t>
       </w:r>
     </w:p>
     <w:p>
@@ -670,7 +755,7 @@
         <w:pStyle w:val="ListBullet"/>
       </w:pPr>
       <w:r>
-        <w:t>Separar linguagem comercial de decisão formal da seguradora.</w:t>
+        <w:t>一般説明と保険会社の正式判断を分けて説明する。</w:t>
       </w:r>
     </w:p>
     <w:p>
@@ -678,7 +763,7 @@
         <w:pStyle w:val="Heading2"/>
       </w:pPr>
       <w:r>
-        <w:t>Pontos de atenção para o corretor</w:t>
+        <w:t>募集人の注意点</w:t>
       </w:r>
     </w:p>
     <w:p>
@@ -686,7 +771,7 @@
         <w:pStyle w:val="ListBullet"/>
       </w:pPr>
       <w:r>
-        <w:t>Confirmar se o imóvel é próprio ou alugado.</w:t>
+        <w:t>契約書、保険証券、事故状況、写真、領収書、管理会社からの案内を確認する。</w:t>
       </w:r>
     </w:p>
     <w:p>
@@ -694,7 +779,7 @@
         <w:pStyle w:val="ListBullet"/>
       </w:pPr>
       <w:r>
-        <w:t>Separar edificação, bens domésticos e cláusulas adicionais.</w:t>
+        <w:t>支払可否、費用負担、返金、審査結果を断定しない。</w:t>
       </w:r>
     </w:p>
     <w:p>
@@ -702,7 +787,7 @@
         <w:pStyle w:val="ListBullet"/>
       </w:pPr>
       <w:r>
-        <w:t>Evitar afirmar pagamento antes da análise do contrato e dos documentos.</w:t>
+        <w:t>お客様が理解できる短いポルトガル語で説明する。</w:t>
       </w:r>
     </w:p>
     <w:p>
@@ -710,7 +795,7 @@
         <w:pStyle w:val="Heading2"/>
       </w:pPr>
       <w:r>
-        <w:t>Casos relacionados</w:t>
+        <w:t>関連ケース</w:t>
       </w:r>
     </w:p>
     <w:p>
@@ -734,7 +819,7 @@
         <w:pStyle w:val="Heading2"/>
       </w:pPr>
       <w:r>
-        <w:t>Termos relacionados</w:t>
+        <w:t>関連用語</w:t>
       </w:r>
     </w:p>
     <w:p>
@@ -774,7 +859,7 @@
         <w:pStyle w:val="Heading2"/>
       </w:pPr>
       <w:r>
-        <w:t>FAQs relacionadas</w:t>
+        <w:t>関連FAQ</w:t>
       </w:r>
     </w:p>
     <w:p>
@@ -814,7 +899,7 @@
         <w:pStyle w:val="Heading2"/>
       </w:pPr>
       <w:r>
-        <w:t>Referências cruzadas</w:t>
+        <w:t>相互参照</w:t>
       </w:r>
     </w:p>
     <w:p>
@@ -854,7 +939,7 @@
         <w:pStyle w:val="Heading2"/>
       </w:pPr>
       <w:r>
-        <w:t>Referências</w:t>
+        <w:t>参考資料</w:t>
       </w:r>
     </w:p>
     <w:p>
@@ -870,7 +955,7 @@
         <w:pStyle w:val="Heading2"/>
       </w:pPr>
       <w:r>
-        <w:t>Tags</w:t>
+        <w:t>タグ</w:t>
       </w:r>
     </w:p>
     <w:p>
@@ -902,7 +987,7 @@
         <w:pStyle w:val="ListBullet"/>
       </w:pPr>
       <w:r>
-        <w:t>seguro-contra-incêndio</w:t>
+        <w:t>japanese-broker</w:t>
       </w:r>
     </w:p>
     <w:p>
@@ -910,7 +995,7 @@
         <w:pStyle w:val="Heading2"/>
       </w:pPr>
       <w:r>
-        <w:t>Veja também</w:t>
+        <w:t>関連項目</w:t>
       </w:r>
     </w:p>
     <w:p>
@@ -926,7 +1011,7 @@
         <w:pStyle w:val="Heading2"/>
       </w:pPr>
       <w:r>
-        <w:t>Histórico de revisão</w:t>
+        <w:t>改訂履歴</w:t>
       </w:r>
     </w:p>
     <w:p>
@@ -946,6 +1031,11 @@
     </w:p>
     <w:p>
       <w:r>
+        <w:t>| 2026-06-27 | 0.2 | JP-BR Insurance Knowledge Base | Padronização para uso do corretor japonês com fala em português e leitura em katakana. |</w:t>
+      </w:r>
+    </w:p>
+    <w:p>
+      <w:r>
         <w:br w:type="page"/>
       </w:r>
     </w:p>
@@ -962,7 +1052,7 @@
         <w:pStyle w:val="Heading2"/>
       </w:pPr>
       <w:r>
-        <w:t>Controle</w:t>
+        <w:t>管理情報</w:t>
       </w:r>
     </w:p>
     <w:p>
@@ -970,7 +1060,7 @@
         <w:pStyle w:val="ListBullet"/>
       </w:pPr>
       <w:r>
-        <w:t>Versão: 0.1</w:t>
+        <w:t>Versão: 0.2</w:t>
       </w:r>
     </w:p>
     <w:p>
@@ -994,7 +1084,7 @@
         <w:pStyle w:val="ListBullet"/>
       </w:pPr>
       <w:r>
-        <w:t>Histórico: Criação inicial.</w:t>
+        <w:t>Histórico: Criação inicial; padronização para uso do corretor japonês com fala em português e leitura em katakana.</w:t>
       </w:r>
     </w:p>
     <w:p>
@@ -1002,7 +1092,7 @@
         <w:pStyle w:val="Heading2"/>
       </w:pPr>
       <w:r>
-        <w:t>Código</w:t>
+        <w:t>コード</w:t>
       </w:r>
     </w:p>
     <w:p>
@@ -1015,12 +1105,12 @@
         <w:pStyle w:val="Heading2"/>
       </w:pPr>
       <w:r>
-        <w:t>Situação de atendimento</w:t>
-      </w:r>
-    </w:p>
-    <w:p>
-      <w:r>
-        <w:t>Cliente brasileiro quer entender danos por vento, granizo e neve no seguro contra incêndio no Japão.</w:t>
+        <w:t>対応場面</w:t>
+      </w:r>
+    </w:p>
+    <w:p>
+      <w:r>
+        <w:t>ブラジル人のお客様が「Danos por vento, granizo e neve」について相談しており、契約内容、補償範囲、責任関係、必要書類を確認する場面。</w:t>
       </w:r>
     </w:p>
     <w:p>
@@ -1028,7 +1118,7 @@
         <w:pStyle w:val="Heading2"/>
       </w:pPr>
       <w:r>
-        <w:t>Participantes</w:t>
+        <w:t>参加者</w:t>
       </w:r>
     </w:p>
     <w:p>
@@ -1036,7 +1126,7 @@
         <w:pStyle w:val="ListBullet"/>
       </w:pPr>
       <w:r>
-        <w:t>Corretor: corretor japonês</w:t>
+        <w:t>募集人: 日本人保険募集人</w:t>
       </w:r>
     </w:p>
     <w:p>
@@ -1044,7 +1134,7 @@
         <w:pStyle w:val="ListBullet"/>
       </w:pPr>
       <w:r>
-        <w:t>Cliente: cliente brasileiro residente no Japão</w:t>
+        <w:t>顧客: 日本在住のブラジル人顧客</w:t>
       </w:r>
     </w:p>
     <w:p>
@@ -1052,12 +1142,12 @@
         <w:pStyle w:val="Heading2"/>
       </w:pPr>
       <w:r>
-        <w:t>Objetivo do diálogo</w:t>
-      </w:r>
-    </w:p>
-    <w:p>
-      <w:r>
-        <w:t>Explicar danos por vento, granizo e neve com linguagem simples e sem prometer pagamento de indenização.</w:t>
+        <w:t>対話の目的</w:t>
+      </w:r>
+    </w:p>
+    <w:p>
+      <w:r>
+        <w:t>日本語で対応方針を理解し、ブラジルポルトガル語でお客様に自然に説明できるようにする。</w:t>
       </w:r>
     </w:p>
     <w:p>
@@ -1065,27 +1155,27 @@
         <w:pStyle w:val="Heading2"/>
       </w:pPr>
       <w:r>
-        <w:t>Versão em japonês</w:t>
-      </w:r>
-    </w:p>
-    <w:p>
-      <w:r>
-        <w:t>**Cliente:** 火災保険では何を確認すればよいですか。</w:t>
-      </w:r>
-    </w:p>
-    <w:p>
-      <w:r>
-        <w:t>**Corretor:** 建物、家財、補償範囲、免責金額を分けて確認します。</w:t>
-      </w:r>
-    </w:p>
-    <w:p>
-      <w:r>
-        <w:t>**Cliente:** 事故があれば必ず支払われますか。</w:t>
-      </w:r>
-    </w:p>
-    <w:p>
-      <w:r>
-        <w:t>**Corretor:** 支払可否は事故原因、契約条件、必要書類を保険会社が確認して判断します。</w:t>
+        <w:t>日本語版</w:t>
+      </w:r>
+    </w:p>
+    <w:p>
+      <w:r>
+        <w:t>**顧客:** 火災保険では何を確認すればよいですか。</w:t>
+      </w:r>
+    </w:p>
+    <w:p>
+      <w:r>
+        <w:t>**募集人:** 建物、家財、補償範囲、免責金額を分けて確認します。</w:t>
+      </w:r>
+    </w:p>
+    <w:p>
+      <w:r>
+        <w:t>**顧客:** 事故があれば必ず支払われますか。</w:t>
+      </w:r>
+    </w:p>
+    <w:p>
+      <w:r>
+        <w:t>**募集人:** 支払可否は事故原因、契約条件、必要書類を保険会社が確認して判断します。</w:t>
       </w:r>
     </w:p>
     <w:p>
@@ -1093,27 +1183,67 @@
         <w:pStyle w:val="Heading2"/>
       </w:pPr>
       <w:r>
-        <w:t>Versão em português brasileiro</w:t>
-      </w:r>
-    </w:p>
-    <w:p>
-      <w:r>
-        <w:t>**Cliente:** O que eu preciso conferir no seguro contra incêndio?</w:t>
-      </w:r>
-    </w:p>
-    <w:p>
-      <w:r>
-        <w:t>**Corretor:** Vamos separar edificação, bens domésticos, coberturas e franquia.</w:t>
-      </w:r>
-    </w:p>
-    <w:p>
-      <w:r>
-        <w:t>**Cliente:** Se acontecer um dano, sempre vou receber?</w:t>
-      </w:r>
-    </w:p>
-    <w:p>
-      <w:r>
-        <w:t>**Corretor:** A seguradora analisa a causa, as condições do contrato e os documentos antes de decidir o pagamento.</w:t>
+        <w:t>ブラジルポルトガル語版</w:t>
+      </w:r>
+    </w:p>
+    <w:p>
+      <w:r>
+        <w:t>**顧客:**</w:t>
+      </w:r>
+    </w:p>
+    <w:p>
+      <w:r>
+        <w:t>Leitura para pronúncia: オ オ キ エウ プレシーゾ コンフェリール ノ セグーロ コントラ インセンジオ</w:t>
+      </w:r>
+    </w:p>
+    <w:p>
+      <w:r>
+        <w:t>Português brasileiro: O que eu preciso conferir no seguro contra incêndio?</w:t>
+      </w:r>
+    </w:p>
+    <w:p>
+      <w:r>
+        <w:t>**Corretor:**</w:t>
+      </w:r>
+    </w:p>
+    <w:p>
+      <w:r>
+        <w:t>Leitura para pronúncia: ヴァモス セパラール エジフィカサォン ベンス ドメスチコス コベルツーラス イ フランキア</w:t>
+      </w:r>
+    </w:p>
+    <w:p>
+      <w:r>
+        <w:t>Português brasileiro: Vamos separar edificação, bens domésticos, coberturas e franquia.</w:t>
+      </w:r>
+    </w:p>
+    <w:p>
+      <w:r>
+        <w:t>**顧客:**</w:t>
+      </w:r>
+    </w:p>
+    <w:p>
+      <w:r>
+        <w:t>Leitura para pronúncia: セ アコンテセール ウン ダノ センプリ ヴォウ ヘセベール</w:t>
+      </w:r>
+    </w:p>
+    <w:p>
+      <w:r>
+        <w:t>Português brasileiro: Se acontecer um dano, sempre vou receber?</w:t>
+      </w:r>
+    </w:p>
+    <w:p>
+      <w:r>
+        <w:t>**Corretor:**</w:t>
+      </w:r>
+    </w:p>
+    <w:p>
+      <w:r>
+        <w:t>Leitura para pronúncia: ア セグラドーラ ANALISA ア カウザ AS CONDIÇÕES ド コントラート イ OS ドクメントス アンチス ジ デシジール オ パガメント</w:t>
+      </w:r>
+    </w:p>
+    <w:p>
+      <w:r>
+        <w:t>Português brasileiro: A seguradora analisa a causa, as condições do contrato e os documentos antes de decidir o pagamento.</w:t>
       </w:r>
     </w:p>
     <w:p>
@@ -1121,7 +1251,7 @@
         <w:pStyle w:val="Heading2"/>
       </w:pPr>
       <w:r>
-        <w:t>Notas culturais ou comerciais</w:t>
+        <w:t>文化・営業上の注意</w:t>
       </w:r>
     </w:p>
     <w:p>
@@ -1129,7 +1259,7 @@
         <w:pStyle w:val="ListBullet"/>
       </w:pPr>
       <w:r>
-        <w:t>Explicar que seguro contra incêndio no Japão pode incluir riscos além de fogo, conforme contratação.</w:t>
+        <w:t>不動産会社、管理会社、保証会社、保険会社の役割を混同しない。</w:t>
       </w:r>
     </w:p>
     <w:p>
@@ -1137,7 +1267,7 @@
         <w:pStyle w:val="ListBullet"/>
       </w:pPr>
       <w:r>
-        <w:t>Separar linguagem comercial de decisão formal da seguradora.</w:t>
+        <w:t>一般説明と保険会社の正式判断を分けて説明する。</w:t>
       </w:r>
     </w:p>
     <w:p>
@@ -1145,7 +1275,7 @@
         <w:pStyle w:val="Heading2"/>
       </w:pPr>
       <w:r>
-        <w:t>Pontos de atenção para o corretor</w:t>
+        <w:t>募集人の注意点</w:t>
       </w:r>
     </w:p>
     <w:p>
@@ -1153,7 +1283,7 @@
         <w:pStyle w:val="ListBullet"/>
       </w:pPr>
       <w:r>
-        <w:t>Confirmar se o imóvel é próprio ou alugado.</w:t>
+        <w:t>契約書、保険証券、事故状況、写真、領収書、管理会社からの案内を確認する。</w:t>
       </w:r>
     </w:p>
     <w:p>
@@ -1161,7 +1291,7 @@
         <w:pStyle w:val="ListBullet"/>
       </w:pPr>
       <w:r>
-        <w:t>Separar edificação, bens domésticos e cláusulas adicionais.</w:t>
+        <w:t>支払可否、費用負担、返金、審査結果を断定しない。</w:t>
       </w:r>
     </w:p>
     <w:p>
@@ -1169,7 +1299,7 @@
         <w:pStyle w:val="ListBullet"/>
       </w:pPr>
       <w:r>
-        <w:t>Evitar afirmar pagamento antes da análise do contrato e dos documentos.</w:t>
+        <w:t>お客様が理解できる短いポルトガル語で説明する。</w:t>
       </w:r>
     </w:p>
     <w:p>
@@ -1177,7 +1307,7 @@
         <w:pStyle w:val="Heading2"/>
       </w:pPr>
       <w:r>
-        <w:t>Casos relacionados</w:t>
+        <w:t>関連ケース</w:t>
       </w:r>
     </w:p>
     <w:p>
@@ -1201,7 +1331,7 @@
         <w:pStyle w:val="Heading2"/>
       </w:pPr>
       <w:r>
-        <w:t>Termos relacionados</w:t>
+        <w:t>関連用語</w:t>
       </w:r>
     </w:p>
     <w:p>
@@ -1241,7 +1371,7 @@
         <w:pStyle w:val="Heading2"/>
       </w:pPr>
       <w:r>
-        <w:t>FAQs relacionadas</w:t>
+        <w:t>関連FAQ</w:t>
       </w:r>
     </w:p>
     <w:p>
@@ -1281,7 +1411,7 @@
         <w:pStyle w:val="Heading2"/>
       </w:pPr>
       <w:r>
-        <w:t>Referências cruzadas</w:t>
+        <w:t>相互参照</w:t>
       </w:r>
     </w:p>
     <w:p>
@@ -1321,7 +1451,7 @@
         <w:pStyle w:val="Heading2"/>
       </w:pPr>
       <w:r>
-        <w:t>Referências</w:t>
+        <w:t>参考資料</w:t>
       </w:r>
     </w:p>
     <w:p>
@@ -1337,7 +1467,7 @@
         <w:pStyle w:val="Heading2"/>
       </w:pPr>
       <w:r>
-        <w:t>Tags</w:t>
+        <w:t>タグ</w:t>
       </w:r>
     </w:p>
     <w:p>
@@ -1369,7 +1499,7 @@
         <w:pStyle w:val="ListBullet"/>
       </w:pPr>
       <w:r>
-        <w:t>seguro-contra-incêndio</w:t>
+        <w:t>japanese-broker</w:t>
       </w:r>
     </w:p>
     <w:p>
@@ -1377,7 +1507,7 @@
         <w:pStyle w:val="Heading2"/>
       </w:pPr>
       <w:r>
-        <w:t>Veja também</w:t>
+        <w:t>関連項目</w:t>
       </w:r>
     </w:p>
     <w:p>
@@ -1393,7 +1523,7 @@
         <w:pStyle w:val="Heading2"/>
       </w:pPr>
       <w:r>
-        <w:t>Histórico de revisão</w:t>
+        <w:t>改訂履歴</w:t>
       </w:r>
     </w:p>
     <w:p>
@@ -1413,6 +1543,11 @@
     </w:p>
     <w:p>
       <w:r>
+        <w:t>| 2026-06-27 | 0.2 | JP-BR Insurance Knowledge Base | Padronização para uso do corretor japonês com fala em português e leitura em katakana. |</w:t>
+      </w:r>
+    </w:p>
+    <w:p>
+      <w:r>
         <w:br w:type="page"/>
       </w:r>
     </w:p>
@@ -1429,7 +1564,7 @@
         <w:pStyle w:val="Heading2"/>
       </w:pPr>
       <w:r>
-        <w:t>Controle</w:t>
+        <w:t>管理情報</w:t>
       </w:r>
     </w:p>
     <w:p>
@@ -1437,7 +1572,7 @@
         <w:pStyle w:val="ListBullet"/>
       </w:pPr>
       <w:r>
-        <w:t>Versão: 0.1</w:t>
+        <w:t>Versão: 0.2</w:t>
       </w:r>
     </w:p>
     <w:p>
@@ -1461,7 +1596,7 @@
         <w:pStyle w:val="ListBullet"/>
       </w:pPr>
       <w:r>
-        <w:t>Histórico: Criação inicial.</w:t>
+        <w:t>Histórico: Criação inicial; padronização para uso do corretor japonês com fala em português e leitura em katakana.</w:t>
       </w:r>
     </w:p>
     <w:p>
@@ -1469,7 +1604,7 @@
         <w:pStyle w:val="Heading2"/>
       </w:pPr>
       <w:r>
-        <w:t>Código</w:t>
+        <w:t>コード</w:t>
       </w:r>
     </w:p>
     <w:p>
@@ -1482,12 +1617,12 @@
         <w:pStyle w:val="Heading2"/>
       </w:pPr>
       <w:r>
-        <w:t>Situação de atendimento</w:t>
-      </w:r>
-    </w:p>
-    <w:p>
-      <w:r>
-        <w:t>Cliente brasileiro quer entender inundação, vazamento e roubo no seguro contra incêndio no Japão.</w:t>
+        <w:t>対応場面</w:t>
+      </w:r>
+    </w:p>
+    <w:p>
+      <w:r>
+        <w:t>ブラジル人のお客様が「Inundação, vazamento e roubo」について相談しており、契約内容、補償範囲、責任関係、必要書類を確認する場面。</w:t>
       </w:r>
     </w:p>
     <w:p>
@@ -1495,7 +1630,7 @@
         <w:pStyle w:val="Heading2"/>
       </w:pPr>
       <w:r>
-        <w:t>Participantes</w:t>
+        <w:t>参加者</w:t>
       </w:r>
     </w:p>
     <w:p>
@@ -1503,7 +1638,7 @@
         <w:pStyle w:val="ListBullet"/>
       </w:pPr>
       <w:r>
-        <w:t>Corretor: corretor japonês</w:t>
+        <w:t>募集人: 日本人保険募集人</w:t>
       </w:r>
     </w:p>
     <w:p>
@@ -1511,7 +1646,7 @@
         <w:pStyle w:val="ListBullet"/>
       </w:pPr>
       <w:r>
-        <w:t>Cliente: cliente brasileiro residente no Japão</w:t>
+        <w:t>顧客: 日本在住のブラジル人顧客</w:t>
       </w:r>
     </w:p>
     <w:p>
@@ -1519,12 +1654,12 @@
         <w:pStyle w:val="Heading2"/>
       </w:pPr>
       <w:r>
-        <w:t>Objetivo do diálogo</w:t>
-      </w:r>
-    </w:p>
-    <w:p>
-      <w:r>
-        <w:t>Explicar inundação, vazamento e roubo com linguagem simples e sem prometer pagamento de indenização.</w:t>
+        <w:t>対話の目的</w:t>
+      </w:r>
+    </w:p>
+    <w:p>
+      <w:r>
+        <w:t>日本語で対応方針を理解し、ブラジルポルトガル語でお客様に自然に説明できるようにする。</w:t>
       </w:r>
     </w:p>
     <w:p>
@@ -1532,27 +1667,27 @@
         <w:pStyle w:val="Heading2"/>
       </w:pPr>
       <w:r>
-        <w:t>Versão em japonês</w:t>
-      </w:r>
-    </w:p>
-    <w:p>
-      <w:r>
-        <w:t>**Cliente:** 火災保険では何を確認すればよいですか。</w:t>
-      </w:r>
-    </w:p>
-    <w:p>
-      <w:r>
-        <w:t>**Corretor:** 建物、家財、補償範囲、免責金額を分けて確認します。</w:t>
-      </w:r>
-    </w:p>
-    <w:p>
-      <w:r>
-        <w:t>**Cliente:** 事故があれば必ず支払われますか。</w:t>
-      </w:r>
-    </w:p>
-    <w:p>
-      <w:r>
-        <w:t>**Corretor:** 支払可否は事故原因、契約条件、必要書類を保険会社が確認して判断します。</w:t>
+        <w:t>日本語版</w:t>
+      </w:r>
+    </w:p>
+    <w:p>
+      <w:r>
+        <w:t>**顧客:** 火災保険では何を確認すればよいですか。</w:t>
+      </w:r>
+    </w:p>
+    <w:p>
+      <w:r>
+        <w:t>**募集人:** 建物、家財、補償範囲、免責金額を分けて確認します。</w:t>
+      </w:r>
+    </w:p>
+    <w:p>
+      <w:r>
+        <w:t>**顧客:** 事故があれば必ず支払われますか。</w:t>
+      </w:r>
+    </w:p>
+    <w:p>
+      <w:r>
+        <w:t>**募集人:** 支払可否は事故原因、契約条件、必要書類を保険会社が確認して判断します。</w:t>
       </w:r>
     </w:p>
     <w:p>
@@ -1560,27 +1695,67 @@
         <w:pStyle w:val="Heading2"/>
       </w:pPr>
       <w:r>
-        <w:t>Versão em português brasileiro</w:t>
-      </w:r>
-    </w:p>
-    <w:p>
-      <w:r>
-        <w:t>**Cliente:** O que eu preciso conferir no seguro contra incêndio?</w:t>
-      </w:r>
-    </w:p>
-    <w:p>
-      <w:r>
-        <w:t>**Corretor:** Vamos separar edificação, bens domésticos, coberturas e franquia.</w:t>
-      </w:r>
-    </w:p>
-    <w:p>
-      <w:r>
-        <w:t>**Cliente:** Se acontecer um dano, sempre vou receber?</w:t>
-      </w:r>
-    </w:p>
-    <w:p>
-      <w:r>
-        <w:t>**Corretor:** A seguradora analisa a causa, as condições do contrato e os documentos antes de decidir o pagamento.</w:t>
+        <w:t>ブラジルポルトガル語版</w:t>
+      </w:r>
+    </w:p>
+    <w:p>
+      <w:r>
+        <w:t>**顧客:**</w:t>
+      </w:r>
+    </w:p>
+    <w:p>
+      <w:r>
+        <w:t>Leitura para pronúncia: オ オ キ エウ プレシーゾ コンフェリール ノ セグーロ コントラ インセンジオ</w:t>
+      </w:r>
+    </w:p>
+    <w:p>
+      <w:r>
+        <w:t>Português brasileiro: O que eu preciso conferir no seguro contra incêndio?</w:t>
+      </w:r>
+    </w:p>
+    <w:p>
+      <w:r>
+        <w:t>**Corretor:**</w:t>
+      </w:r>
+    </w:p>
+    <w:p>
+      <w:r>
+        <w:t>Leitura para pronúncia: ヴァモス セパラール エジフィカサォン ベンス ドメスチコス コベルツーラス イ フランキア</w:t>
+      </w:r>
+    </w:p>
+    <w:p>
+      <w:r>
+        <w:t>Português brasileiro: Vamos separar edificação, bens domésticos, coberturas e franquia.</w:t>
+      </w:r>
+    </w:p>
+    <w:p>
+      <w:r>
+        <w:t>**顧客:**</w:t>
+      </w:r>
+    </w:p>
+    <w:p>
+      <w:r>
+        <w:t>Leitura para pronúncia: セ アコンテセール ウン ダノ センプリ ヴォウ ヘセベール</w:t>
+      </w:r>
+    </w:p>
+    <w:p>
+      <w:r>
+        <w:t>Português brasileiro: Se acontecer um dano, sempre vou receber?</w:t>
+      </w:r>
+    </w:p>
+    <w:p>
+      <w:r>
+        <w:t>**Corretor:**</w:t>
+      </w:r>
+    </w:p>
+    <w:p>
+      <w:r>
+        <w:t>Leitura para pronúncia: ア セグラドーラ ANALISA ア カウザ AS CONDIÇÕES ド コントラート イ OS ドクメントス アンチス ジ デシジール オ パガメント</w:t>
+      </w:r>
+    </w:p>
+    <w:p>
+      <w:r>
+        <w:t>Português brasileiro: A seguradora analisa a causa, as condições do contrato e os documentos antes de decidir o pagamento.</w:t>
       </w:r>
     </w:p>
     <w:p>
@@ -1588,7 +1763,7 @@
         <w:pStyle w:val="Heading2"/>
       </w:pPr>
       <w:r>
-        <w:t>Notas culturais ou comerciais</w:t>
+        <w:t>文化・営業上の注意</w:t>
       </w:r>
     </w:p>
     <w:p>
@@ -1596,7 +1771,7 @@
         <w:pStyle w:val="ListBullet"/>
       </w:pPr>
       <w:r>
-        <w:t>Explicar que seguro contra incêndio no Japão pode incluir riscos além de fogo, conforme contratação.</w:t>
+        <w:t>不動産会社、管理会社、保証会社、保険会社の役割を混同しない。</w:t>
       </w:r>
     </w:p>
     <w:p>
@@ -1604,7 +1779,7 @@
         <w:pStyle w:val="ListBullet"/>
       </w:pPr>
       <w:r>
-        <w:t>Separar linguagem comercial de decisão formal da seguradora.</w:t>
+        <w:t>一般説明と保険会社の正式判断を分けて説明する。</w:t>
       </w:r>
     </w:p>
     <w:p>
@@ -1612,7 +1787,7 @@
         <w:pStyle w:val="Heading2"/>
       </w:pPr>
       <w:r>
-        <w:t>Pontos de atenção para o corretor</w:t>
+        <w:t>募集人の注意点</w:t>
       </w:r>
     </w:p>
     <w:p>
@@ -1620,7 +1795,7 @@
         <w:pStyle w:val="ListBullet"/>
       </w:pPr>
       <w:r>
-        <w:t>Confirmar se o imóvel é próprio ou alugado.</w:t>
+        <w:t>契約書、保険証券、事故状況、写真、領収書、管理会社からの案内を確認する。</w:t>
       </w:r>
     </w:p>
     <w:p>
@@ -1628,7 +1803,7 @@
         <w:pStyle w:val="ListBullet"/>
       </w:pPr>
       <w:r>
-        <w:t>Separar edificação, bens domésticos e cláusulas adicionais.</w:t>
+        <w:t>支払可否、費用負担、返金、審査結果を断定しない。</w:t>
       </w:r>
     </w:p>
     <w:p>
@@ -1636,7 +1811,7 @@
         <w:pStyle w:val="ListBullet"/>
       </w:pPr>
       <w:r>
-        <w:t>Evitar afirmar pagamento antes da análise do contrato e dos documentos.</w:t>
+        <w:t>お客様が理解できる短いポルトガル語で説明する。</w:t>
       </w:r>
     </w:p>
     <w:p>
@@ -1644,7 +1819,7 @@
         <w:pStyle w:val="Heading2"/>
       </w:pPr>
       <w:r>
-        <w:t>Casos relacionados</w:t>
+        <w:t>関連ケース</w:t>
       </w:r>
     </w:p>
     <w:p>
@@ -1668,7 +1843,7 @@
         <w:pStyle w:val="Heading2"/>
       </w:pPr>
       <w:r>
-        <w:t>Termos relacionados</w:t>
+        <w:t>関連用語</w:t>
       </w:r>
     </w:p>
     <w:p>
@@ -1708,7 +1883,7 @@
         <w:pStyle w:val="Heading2"/>
       </w:pPr>
       <w:r>
-        <w:t>FAQs relacionadas</w:t>
+        <w:t>関連FAQ</w:t>
       </w:r>
     </w:p>
     <w:p>
@@ -1748,7 +1923,7 @@
         <w:pStyle w:val="Heading2"/>
       </w:pPr>
       <w:r>
-        <w:t>Referências cruzadas</w:t>
+        <w:t>相互参照</w:t>
       </w:r>
     </w:p>
     <w:p>
@@ -1788,7 +1963,7 @@
         <w:pStyle w:val="Heading2"/>
       </w:pPr>
       <w:r>
-        <w:t>Referências</w:t>
+        <w:t>参考資料</w:t>
       </w:r>
     </w:p>
     <w:p>
@@ -1804,7 +1979,7 @@
         <w:pStyle w:val="Heading2"/>
       </w:pPr>
       <w:r>
-        <w:t>Tags</w:t>
+        <w:t>タグ</w:t>
       </w:r>
     </w:p>
     <w:p>
@@ -1836,7 +2011,7 @@
         <w:pStyle w:val="ListBullet"/>
       </w:pPr>
       <w:r>
-        <w:t>seguro-contra-incêndio</w:t>
+        <w:t>japanese-broker</w:t>
       </w:r>
     </w:p>
     <w:p>
@@ -1844,7 +2019,7 @@
         <w:pStyle w:val="Heading2"/>
       </w:pPr>
       <w:r>
-        <w:t>Veja também</w:t>
+        <w:t>関連項目</w:t>
       </w:r>
     </w:p>
     <w:p>
@@ -1860,7 +2035,7 @@
         <w:pStyle w:val="Heading2"/>
       </w:pPr>
       <w:r>
-        <w:t>Histórico de revisão</w:t>
+        <w:t>改訂履歴</w:t>
       </w:r>
     </w:p>
     <w:p>
@@ -1880,6 +2055,11 @@
     </w:p>
     <w:p>
       <w:r>
+        <w:t>| 2026-06-27 | 0.2 | JP-BR Insurance Knowledge Base | Padronização para uso do corretor japonês com fala em português e leitura em katakana. |</w:t>
+      </w:r>
+    </w:p>
+    <w:p>
+      <w:r>
         <w:br w:type="page"/>
       </w:r>
     </w:p>
@@ -1896,7 +2076,7 @@
         <w:pStyle w:val="Heading2"/>
       </w:pPr>
       <w:r>
-        <w:t>Controle</w:t>
+        <w:t>管理情報</w:t>
       </w:r>
     </w:p>
     <w:p>
@@ -1904,7 +2084,7 @@
         <w:pStyle w:val="ListBullet"/>
       </w:pPr>
       <w:r>
-        <w:t>Versão: 0.1</w:t>
+        <w:t>Versão: 0.2</w:t>
       </w:r>
     </w:p>
     <w:p>
@@ -1928,7 +2108,7 @@
         <w:pStyle w:val="ListBullet"/>
       </w:pPr>
       <w:r>
-        <w:t>Histórico: Criação inicial.</w:t>
+        <w:t>Histórico: Criação inicial; padronização para uso do corretor japonês com fala em português e leitura em katakana.</w:t>
       </w:r>
     </w:p>
     <w:p>
@@ -1936,7 +2116,7 @@
         <w:pStyle w:val="Heading2"/>
       </w:pPr>
       <w:r>
-        <w:t>Código</w:t>
+        <w:t>コード</w:t>
       </w:r>
     </w:p>
     <w:p>
@@ -1949,12 +2129,12 @@
         <w:pStyle w:val="Heading2"/>
       </w:pPr>
       <w:r>
-        <w:t>Situação de atendimento</w:t>
-      </w:r>
-    </w:p>
-    <w:p>
-      <w:r>
-        <w:t>Cliente brasileiro quer entender dano acidental, terremoto e responsabilidade civil no seguro contra incêndio no Japão.</w:t>
+        <w:t>対応場面</w:t>
+      </w:r>
+    </w:p>
+    <w:p>
+      <w:r>
+        <w:t>ブラジル人のお客様が「Dano acidental, terremoto e responsabilidade civil」について相談しており、契約内容、補償範囲、責任関係、必要書類を確認する場面。</w:t>
       </w:r>
     </w:p>
     <w:p>
@@ -1962,7 +2142,7 @@
         <w:pStyle w:val="Heading2"/>
       </w:pPr>
       <w:r>
-        <w:t>Participantes</w:t>
+        <w:t>参加者</w:t>
       </w:r>
     </w:p>
     <w:p>
@@ -1970,7 +2150,7 @@
         <w:pStyle w:val="ListBullet"/>
       </w:pPr>
       <w:r>
-        <w:t>Corretor: corretor japonês</w:t>
+        <w:t>募集人: 日本人保険募集人</w:t>
       </w:r>
     </w:p>
     <w:p>
@@ -1978,7 +2158,7 @@
         <w:pStyle w:val="ListBullet"/>
       </w:pPr>
       <w:r>
-        <w:t>Cliente: cliente brasileiro residente no Japão</w:t>
+        <w:t>顧客: 日本在住のブラジル人顧客</w:t>
       </w:r>
     </w:p>
     <w:p>
@@ -1986,12 +2166,12 @@
         <w:pStyle w:val="Heading2"/>
       </w:pPr>
       <w:r>
-        <w:t>Objetivo do diálogo</w:t>
-      </w:r>
-    </w:p>
-    <w:p>
-      <w:r>
-        <w:t>Explicar dano acidental, terremoto e responsabilidade civil com linguagem simples e sem prometer pagamento de indenização.</w:t>
+        <w:t>対話の目的</w:t>
+      </w:r>
+    </w:p>
+    <w:p>
+      <w:r>
+        <w:t>日本語で対応方針を理解し、ブラジルポルトガル語でお客様に自然に説明できるようにする。</w:t>
       </w:r>
     </w:p>
     <w:p>
@@ -1999,27 +2179,27 @@
         <w:pStyle w:val="Heading2"/>
       </w:pPr>
       <w:r>
-        <w:t>Versão em japonês</w:t>
-      </w:r>
-    </w:p>
-    <w:p>
-      <w:r>
-        <w:t>**Cliente:** 火災保険では何を確認すればよいですか。</w:t>
-      </w:r>
-    </w:p>
-    <w:p>
-      <w:r>
-        <w:t>**Corretor:** 建物、家財、補償範囲、免責金額を分けて確認します。</w:t>
-      </w:r>
-    </w:p>
-    <w:p>
-      <w:r>
-        <w:t>**Cliente:** 事故があれば必ず支払われますか。</w:t>
-      </w:r>
-    </w:p>
-    <w:p>
-      <w:r>
-        <w:t>**Corretor:** 支払可否は事故原因、契約条件、必要書類を保険会社が確認して判断します。</w:t>
+        <w:t>日本語版</w:t>
+      </w:r>
+    </w:p>
+    <w:p>
+      <w:r>
+        <w:t>**顧客:** 火災保険では何を確認すればよいですか。</w:t>
+      </w:r>
+    </w:p>
+    <w:p>
+      <w:r>
+        <w:t>**募集人:** 建物、家財、補償範囲、免責金額を分けて確認します。</w:t>
+      </w:r>
+    </w:p>
+    <w:p>
+      <w:r>
+        <w:t>**顧客:** 事故があれば必ず支払われますか。</w:t>
+      </w:r>
+    </w:p>
+    <w:p>
+      <w:r>
+        <w:t>**募集人:** 支払可否は事故原因、契約条件、必要書類を保険会社が確認して判断します。</w:t>
       </w:r>
     </w:p>
     <w:p>
@@ -2027,27 +2207,67 @@
         <w:pStyle w:val="Heading2"/>
       </w:pPr>
       <w:r>
-        <w:t>Versão em português brasileiro</w:t>
-      </w:r>
-    </w:p>
-    <w:p>
-      <w:r>
-        <w:t>**Cliente:** O que eu preciso conferir no seguro contra incêndio?</w:t>
-      </w:r>
-    </w:p>
-    <w:p>
-      <w:r>
-        <w:t>**Corretor:** Vamos separar edificação, bens domésticos, coberturas e franquia.</w:t>
-      </w:r>
-    </w:p>
-    <w:p>
-      <w:r>
-        <w:t>**Cliente:** Se acontecer um dano, sempre vou receber?</w:t>
-      </w:r>
-    </w:p>
-    <w:p>
-      <w:r>
-        <w:t>**Corretor:** A seguradora analisa a causa, as condições do contrato e os documentos antes de decidir o pagamento.</w:t>
+        <w:t>ブラジルポルトガル語版</w:t>
+      </w:r>
+    </w:p>
+    <w:p>
+      <w:r>
+        <w:t>**顧客:**</w:t>
+      </w:r>
+    </w:p>
+    <w:p>
+      <w:r>
+        <w:t>Leitura para pronúncia: オ オ キ エウ プレシーゾ コンフェリール ノ セグーロ コントラ インセンジオ</w:t>
+      </w:r>
+    </w:p>
+    <w:p>
+      <w:r>
+        <w:t>Português brasileiro: O que eu preciso conferir no seguro contra incêndio?</w:t>
+      </w:r>
+    </w:p>
+    <w:p>
+      <w:r>
+        <w:t>**Corretor:**</w:t>
+      </w:r>
+    </w:p>
+    <w:p>
+      <w:r>
+        <w:t>Leitura para pronúncia: ヴァモス セパラール エジフィカサォン ベンス ドメスチコス コベルツーラス イ フランキア</w:t>
+      </w:r>
+    </w:p>
+    <w:p>
+      <w:r>
+        <w:t>Português brasileiro: Vamos separar edificação, bens domésticos, coberturas e franquia.</w:t>
+      </w:r>
+    </w:p>
+    <w:p>
+      <w:r>
+        <w:t>**顧客:**</w:t>
+      </w:r>
+    </w:p>
+    <w:p>
+      <w:r>
+        <w:t>Leitura para pronúncia: セ アコンテセール ウン ダノ センプリ ヴォウ ヘセベール</w:t>
+      </w:r>
+    </w:p>
+    <w:p>
+      <w:r>
+        <w:t>Português brasileiro: Se acontecer um dano, sempre vou receber?</w:t>
+      </w:r>
+    </w:p>
+    <w:p>
+      <w:r>
+        <w:t>**Corretor:**</w:t>
+      </w:r>
+    </w:p>
+    <w:p>
+      <w:r>
+        <w:t>Leitura para pronúncia: ア セグラドーラ ANALISA ア カウザ AS CONDIÇÕES ド コントラート イ OS ドクメントス アンチス ジ デシジール オ パガメント</w:t>
+      </w:r>
+    </w:p>
+    <w:p>
+      <w:r>
+        <w:t>Português brasileiro: A seguradora analisa a causa, as condições do contrato e os documentos antes de decidir o pagamento.</w:t>
       </w:r>
     </w:p>
     <w:p>
@@ -2055,7 +2275,7 @@
         <w:pStyle w:val="Heading2"/>
       </w:pPr>
       <w:r>
-        <w:t>Notas culturais ou comerciais</w:t>
+        <w:t>文化・営業上の注意</w:t>
       </w:r>
     </w:p>
     <w:p>
@@ -2063,7 +2283,7 @@
         <w:pStyle w:val="ListBullet"/>
       </w:pPr>
       <w:r>
-        <w:t>Explicar que seguro contra incêndio no Japão pode incluir riscos além de fogo, conforme contratação.</w:t>
+        <w:t>不動産会社、管理会社、保証会社、保険会社の役割を混同しない。</w:t>
       </w:r>
     </w:p>
     <w:p>
@@ -2071,7 +2291,7 @@
         <w:pStyle w:val="ListBullet"/>
       </w:pPr>
       <w:r>
-        <w:t>Separar linguagem comercial de decisão formal da seguradora.</w:t>
+        <w:t>一般説明と保険会社の正式判断を分けて説明する。</w:t>
       </w:r>
     </w:p>
     <w:p>
@@ -2079,7 +2299,7 @@
         <w:pStyle w:val="Heading2"/>
       </w:pPr>
       <w:r>
-        <w:t>Pontos de atenção para o corretor</w:t>
+        <w:t>募集人の注意点</w:t>
       </w:r>
     </w:p>
     <w:p>
@@ -2087,7 +2307,7 @@
         <w:pStyle w:val="ListBullet"/>
       </w:pPr>
       <w:r>
-        <w:t>Confirmar se o imóvel é próprio ou alugado.</w:t>
+        <w:t>契約書、保険証券、事故状況、写真、領収書、管理会社からの案内を確認する。</w:t>
       </w:r>
     </w:p>
     <w:p>
@@ -2095,7 +2315,7 @@
         <w:pStyle w:val="ListBullet"/>
       </w:pPr>
       <w:r>
-        <w:t>Separar edificação, bens domésticos e cláusulas adicionais.</w:t>
+        <w:t>支払可否、費用負担、返金、審査結果を断定しない。</w:t>
       </w:r>
     </w:p>
     <w:p>
@@ -2103,7 +2323,7 @@
         <w:pStyle w:val="ListBullet"/>
       </w:pPr>
       <w:r>
-        <w:t>Evitar afirmar pagamento antes da análise do contrato e dos documentos.</w:t>
+        <w:t>お客様が理解できる短いポルトガル語で説明する。</w:t>
       </w:r>
     </w:p>
     <w:p>
@@ -2111,7 +2331,7 @@
         <w:pStyle w:val="Heading2"/>
       </w:pPr>
       <w:r>
-        <w:t>Casos relacionados</w:t>
+        <w:t>関連ケース</w:t>
       </w:r>
     </w:p>
     <w:p>
@@ -2119,7 +2339,7 @@
         <w:pStyle w:val="Heading2"/>
       </w:pPr>
       <w:r>
-        <w:t>Termos relacionados</w:t>
+        <w:t>関連用語</w:t>
       </w:r>
     </w:p>
     <w:p>
@@ -2159,7 +2379,7 @@
         <w:pStyle w:val="Heading2"/>
       </w:pPr>
       <w:r>
-        <w:t>FAQs relacionadas</w:t>
+        <w:t>関連FAQ</w:t>
       </w:r>
     </w:p>
     <w:p>
@@ -2199,7 +2419,7 @@
         <w:pStyle w:val="Heading2"/>
       </w:pPr>
       <w:r>
-        <w:t>Referências cruzadas</w:t>
+        <w:t>相互参照</w:t>
       </w:r>
     </w:p>
     <w:p>
@@ -2239,7 +2459,7 @@
         <w:pStyle w:val="Heading2"/>
       </w:pPr>
       <w:r>
-        <w:t>Referências</w:t>
+        <w:t>参考資料</w:t>
       </w:r>
     </w:p>
     <w:p>
@@ -2255,7 +2475,7 @@
         <w:pStyle w:val="Heading2"/>
       </w:pPr>
       <w:r>
-        <w:t>Tags</w:t>
+        <w:t>タグ</w:t>
       </w:r>
     </w:p>
     <w:p>
@@ -2287,7 +2507,7 @@
         <w:pStyle w:val="ListBullet"/>
       </w:pPr>
       <w:r>
-        <w:t>seguro-contra-incêndio</w:t>
+        <w:t>japanese-broker</w:t>
       </w:r>
     </w:p>
     <w:p>
@@ -2295,7 +2515,7 @@
         <w:pStyle w:val="Heading2"/>
       </w:pPr>
       <w:r>
-        <w:t>Veja também</w:t>
+        <w:t>関連項目</w:t>
       </w:r>
     </w:p>
     <w:p>
@@ -2311,7 +2531,7 @@
         <w:pStyle w:val="Heading2"/>
       </w:pPr>
       <w:r>
-        <w:t>Histórico de revisão</w:t>
+        <w:t>改訂履歴</w:t>
       </w:r>
     </w:p>
     <w:p>
@@ -2327,6 +2547,11 @@
     <w:p>
       <w:r>
         <w:t>| 2026-06-27 | 0.1 | JP-BR Insurance Knowledge Base | Criação inicial. |</w:t>
+      </w:r>
+    </w:p>
+    <w:p>
+      <w:r>
+        <w:t>| 2026-06-27 | 0.2 | JP-BR Insurance Knowledge Base | Padronização para uso do corretor japonês com fala em português e leitura em katakana. |</w:t>
       </w:r>
     </w:p>
     <w:sectPr>

</xml_diff>